<commit_message>
Updated SEQUE website content document
</commit_message>
<xml_diff>
--- a/SEQUE - content for updated website.docx
+++ b/SEQUE - content for updated website.docx
@@ -4,7 +4,6 @@
   <w:body>
     <w:p>
       <w:pPr>
-        <w:jc w:val="center"/>
         <w:rPr>
           <w:b/>
           <w:bCs/>
@@ -21,6 +20,16 @@
           <w:szCs w:val="40"/>
           <w:u w:val="single"/>
         </w:rPr>
+        <w:t xml:space="preserve">  </w:t>
+      </w:r>
+      <w:r>
+        <w:rPr>
+          <w:b/>
+          <w:bCs/>
+          <w:sz w:val="36"/>
+          <w:szCs w:val="40"/>
+          <w:u w:val="single"/>
+        </w:rPr>
         <w:t>CONTENT FOR UPDATED WEBSITE</w:t>
       </w:r>
     </w:p>
@@ -295,7 +304,7 @@
           <w:bCs/>
         </w:rPr>
         <w:pict w14:anchorId="32DF5A3E">
-          <v:rect id="_x0000_i1043" style="width:0;height:1.5pt" o:hralign="center" o:hrstd="t" o:hr="t" fillcolor="#a0a0a0" stroked="f"/>
+          <v:rect id="_x0000_i1025" style="width:0;height:1.5pt" o:hralign="center" o:hrstd="t" o:hr="t" fillcolor="#a0a0a0" stroked="f"/>
         </w:pict>
       </w:r>
     </w:p>
@@ -444,7 +453,6 @@
         <w:jc w:val="both"/>
       </w:pPr>
       <w:r>
-        <w:lastRenderedPageBreak/>
         <w:t xml:space="preserve">At Seque Infratech, Ms. Edwards blends her strategic insight with a strong belief in the </w:t>
       </w:r>
       <w:r>
@@ -685,7 +693,7 @@
       </w:pPr>
       <w:r>
         <w:pict w14:anchorId="36EC6608">
-          <v:rect id="_x0000_i1124" style="width:0;height:1.5pt" o:hralign="center" o:hrstd="t" o:hr="t" fillcolor="#a0a0a0" stroked="f"/>
+          <v:rect id="_x0000_i1026" style="width:0;height:1.5pt" o:hralign="center" o:hrstd="t" o:hr="t" fillcolor="#a0a0a0" stroked="f"/>
         </w:pict>
       </w:r>
     </w:p>
@@ -770,7 +778,6 @@
           <w:b/>
           <w:bCs/>
         </w:rPr>
-        <w:lastRenderedPageBreak/>
         <w:t>Jet A</w:t>
       </w:r>
       <w:r>
@@ -844,7 +851,7 @@
       </w:pPr>
       <w:r>
         <w:pict w14:anchorId="261307B7">
-          <v:rect id="_x0000_i1125" style="width:0;height:1.5pt" o:hralign="center" o:hrstd="t" o:hr="t" fillcolor="#a0a0a0" stroked="f"/>
+          <v:rect id="_x0000_i1027" style="width:0;height:1.5pt" o:hralign="center" o:hrstd="t" o:hr="t" fillcolor="#a0a0a0" stroked="f"/>
         </w:pict>
       </w:r>
     </w:p>
@@ -932,7 +939,7 @@
       </w:pPr>
       <w:r>
         <w:pict w14:anchorId="431BC3E8">
-          <v:rect id="_x0000_i1126" style="width:0;height:1.5pt" o:hralign="center" o:hrstd="t" o:hr="t" fillcolor="#a0a0a0" stroked="f"/>
+          <v:rect id="_x0000_i1028" style="width:0;height:1.5pt" o:hralign="center" o:hrstd="t" o:hr="t" fillcolor="#a0a0a0" stroked="f"/>
         </w:pict>
       </w:r>
     </w:p>
@@ -1073,7 +1080,7 @@
       </w:pPr>
       <w:r>
         <w:pict w14:anchorId="1B377F9D">
-          <v:rect id="_x0000_i1127" style="width:0;height:1.5pt" o:hralign="center" o:hrstd="t" o:hr="t" fillcolor="#a0a0a0" stroked="f"/>
+          <v:rect id="_x0000_i1029" style="width:0;height:1.5pt" o:hralign="center" o:hrstd="t" o:hr="t" fillcolor="#a0a0a0" stroked="f"/>
         </w:pict>
       </w:r>
     </w:p>
@@ -1110,7 +1117,6 @@
           <w:b/>
           <w:bCs/>
         </w:rPr>
-        <w:lastRenderedPageBreak/>
         <w:t>Blends Available:</w:t>
       </w:r>
     </w:p>
@@ -1192,7 +1198,7 @@
       </w:pPr>
       <w:r>
         <w:pict w14:anchorId="3B2765D4">
-          <v:rect id="_x0000_i1128" style="width:0;height:1.5pt" o:hralign="center" o:hrstd="t" o:hr="t" fillcolor="#a0a0a0" stroked="f"/>
+          <v:rect id="_x0000_i1030" style="width:0;height:1.5pt" o:hralign="center" o:hrstd="t" o:hr="t" fillcolor="#a0a0a0" stroked="f"/>
         </w:pict>
       </w:r>
     </w:p>
@@ -1297,7 +1303,7 @@
       </w:pPr>
       <w:r>
         <w:pict w14:anchorId="717A4DE7">
-          <v:rect id="_x0000_i1129" style="width:0;height:1.5pt" o:hralign="center" o:hrstd="t" o:hr="t" fillcolor="#a0a0a0" stroked="f"/>
+          <v:rect id="_x0000_i1031" style="width:0;height:1.5pt" o:hralign="center" o:hrstd="t" o:hr="t" fillcolor="#a0a0a0" stroked="f"/>
         </w:pict>
       </w:r>
     </w:p>
@@ -1415,7 +1421,7 @@
       </w:pPr>
       <w:r>
         <w:pict w14:anchorId="7C0B9997">
-          <v:rect id="_x0000_i1130" style="width:0;height:1.5pt" o:hralign="center" o:hrstd="t" o:hr="t" fillcolor="#a0a0a0" stroked="f"/>
+          <v:rect id="_x0000_i1032" style="width:0;height:1.5pt" o:hralign="center" o:hrstd="t" o:hr="t" fillcolor="#a0a0a0" stroked="f"/>
         </w:pict>
       </w:r>
     </w:p>
@@ -1462,7 +1468,6 @@
           <w:b/>
           <w:bCs/>
         </w:rPr>
-        <w:lastRenderedPageBreak/>
         <w:t>Capabilities:</w:t>
       </w:r>
     </w:p>
@@ -1563,7 +1568,7 @@
       </w:pPr>
       <w:r>
         <w:pict w14:anchorId="64102DAA">
-          <v:rect id="_x0000_i1131" style="width:0;height:1.5pt" o:hralign="center" o:hrstd="t" o:hr="t" fillcolor="#a0a0a0" stroked="f"/>
+          <v:rect id="_x0000_i1033" style="width:0;height:1.5pt" o:hralign="center" o:hrstd="t" o:hr="t" fillcolor="#a0a0a0" stroked="f"/>
         </w:pict>
       </w:r>
     </w:p>
@@ -1791,7 +1796,7 @@
       </w:pPr>
       <w:r>
         <w:pict w14:anchorId="5BB4BDAE">
-          <v:rect id="_x0000_i1132" style="width:0;height:1.5pt" o:hralign="center" o:hrstd="t" o:hr="t" fillcolor="#a0a0a0" stroked="f"/>
+          <v:rect id="_x0000_i1034" style="width:0;height:1.5pt" o:hralign="center" o:hrstd="t" o:hr="t" fillcolor="#a0a0a0" stroked="f"/>
         </w:pict>
       </w:r>
     </w:p>
@@ -1869,7 +1874,6 @@
           <w:b/>
           <w:bCs/>
         </w:rPr>
-        <w:lastRenderedPageBreak/>
         <w:t>ESSAR Power Ltd (India)</w:t>
       </w:r>
     </w:p>
@@ -2056,13 +2060,7 @@
         <w:rPr>
           <w:color w:val="FF0000"/>
         </w:rPr>
-        <w:t>Dream It Do It WNY</w:t>
-      </w:r>
-      <w:r>
-        <w:rPr>
-          <w:color w:val="FF0000"/>
-        </w:rPr>
-        <w:t xml:space="preserve"> 2024 with image</w:t>
+        <w:t>Dream It Do It WNY 2024 with image</w:t>
       </w:r>
       <w:r>
         <w:t xml:space="preserve">s </w:t>
@@ -2074,7 +2072,7 @@
       </w:pPr>
       <w:r>
         <w:pict w14:anchorId="3FDD9DC5">
-          <v:rect id="_x0000_i1133" style="width:0;height:1.5pt" o:hralign="center" o:hrstd="t" o:hr="t" fillcolor="#a0a0a0" stroked="f"/>
+          <v:rect id="_x0000_i1035" style="width:0;height:1.5pt" o:hralign="center" o:hrstd="t" o:hr="t" fillcolor="#a0a0a0" stroked="f"/>
         </w:pict>
       </w:r>
     </w:p>
@@ -2303,7 +2301,7 @@
     <w:p>
       <w:r>
         <w:pict w14:anchorId="33FA5513">
-          <v:rect id="_x0000_i1134" style="width:0;height:1.5pt" o:hrstd="t" o:hr="t" fillcolor="#a0a0a0" stroked="f"/>
+          <v:rect id="_x0000_i1036" style="width:0;height:1.5pt" o:hrstd="t" o:hr="t" fillcolor="#a0a0a0" stroked="f"/>
         </w:pict>
       </w:r>
     </w:p>
@@ -4630,6 +4628,7 @@
   <w:style w:type="character" w:default="1" w:styleId="DefaultParagraphFont">
     <w:name w:val="Default Paragraph Font"/>
     <w:uiPriority w:val="1"/>
+    <w:semiHidden/>
     <w:unhideWhenUsed/>
   </w:style>
   <w:style w:type="table" w:default="1" w:styleId="TableNormal">

</xml_diff>